<commit_message>
feat: integrate 'Wonder-Pool' Cascade ('Wonder Bra' Stream Alignment) standards into File 60 and File 66 for advanced brown trout restoration
</commit_message>
<xml_diff>
--- a/03_Project_Case_Studies/Anderson_Creek_Showcase_Project/66_ACR_Master_Restoration_Workflow_&_Trout_Ecology_Guide.docx
+++ b/03_Project_Case_Studies/Anderson_Creek_Showcase_Project/66_ACR_Master_Restoration_Workflow_&_Trout_Ecology_Guide.docx
@@ -940,15 +940,6 @@
         <w:spacing w:after="60"/>
       </w:pPr>
       <w:r>
-        <w:t>*Restoration Design Goal*: To prevent fine silt (d = 0.05 mm) from settling onto spawning gravels, the local shear velocity and upward turbulent fluid forces must exceed the settling velocity (vs = 0.0022 m/s).</w:t>
-      </w:r>
-    </w:p>
-    <w:p>
-      <w:pPr>
-        <w:pStyle w:val="ListBullet"/>
-        <w:spacing w:after="60"/>
-      </w:pPr>
-      <w:r>
         <w:t xml:space="preserve">*Fluvial Solution*: We place </w:t>
       </w:r>
       <w:r>
@@ -977,6 +968,368 @@
       </w:r>
       <w:r>
         <w:t>, concentrating streamflow down the thalweg. This geomorphic constriction locally elevates shear velocity during high-flow events, keeping fine silts in suspension and scouring the spawning gravel beds (D₅₀ = 22mm) clean.</w:t>
+      </w:r>
+    </w:p>
+    <w:p>
+      <w:pPr>
+        <w:spacing w:after="240"/>
+      </w:pPr>
+      <w:r>
+        <w:rPr>
+          <w:color w:val="D9D9D9"/>
+        </w:rPr>
+        <w:t>____________________________________________________</w:t>
+      </w:r>
+    </w:p>
+    <w:p>
+      <w:pPr>
+        <w:spacing w:before="240" w:after="80"/>
+      </w:pPr>
+      <w:r>
+        <w:rPr>
+          <w:b/>
+          <w:color w:val="595959"/>
+          <w:sz w:val="26"/>
+        </w:rPr>
+        <w:t>4. The 'Wonder-Pool' Cascade (The Fluvial Support &amp; Lift Design)</w:t>
+      </w:r>
+    </w:p>
+    <w:p>
+      <w:r>
+        <w:t xml:space="preserve">To achieve the highest tier of stream trout restoration, Blue Ridge Stream Restoration integrates the </w:t>
+      </w:r>
+      <w:r>
+        <w:rPr>
+          <w:b/>
+        </w:rPr>
+        <w:t>'Wonder-Pool' Cascade System</w:t>
+      </w:r>
+      <w:r>
+        <w:t xml:space="preserve"> (our proprietary *Wonder Bra Stream Alignment* design) into its projects. This system is designed as a series of interconnected, cascading pool basins and banks that flow one into another into another, creating an optimal, high-oxygen environment for wild Brown Trout.</w:t>
+      </w:r>
+    </w:p>
+    <w:p>
+      <w:pPr>
+        <w:spacing w:before="120" w:after="120"/>
+        <w:ind w:left="360"/>
+      </w:pPr>
+      <w:r>
+        <w:rPr>
+          <w:rFonts w:ascii="Consolas" w:hAnsi="Consolas"/>
+          <w:color w:val="7F0055"/>
+          <w:sz w:val="19"/>
+        </w:rPr>
+        <w:t xml:space="preserve">                    THE 'WONDER-POOL' CASCADE PROFILE</w:t>
+        <w:br/>
+        <w:t xml:space="preserve">                    </w:t>
+        <w:br/>
+        <w:t xml:space="preserve">   Pool N-1 (Spawning Tail) ---&gt; Aeration Chute (High Turbulence) ---&gt; Pool N (Refuge)</w:t>
+        <w:br/>
+        <w:t xml:space="preserve">   ======================\               /========\                  \</w:t>
+        <w:br/>
+        <w:t xml:space="preserve">    [Gravels: D50=22mm]   \             /          \                  \________________</w:t>
+        <w:br/>
+        <w:t xml:space="preserve">                           \___________/            \===&gt; Plunge       [Deep Coldwater]</w:t>
+        <w:br/>
+        <w:t xml:space="preserve">                            Hyporheic Flow                Mixing        Depth: 1.5m-2.5m</w:t>
+      </w:r>
+    </w:p>
+    <w:p>
+      <w:r>
+        <w:t>#### Fluvial Support &amp; Lift Geomorphology</w:t>
+      </w:r>
+    </w:p>
+    <w:p>
+      <w:r>
+        <w:t>The name is derived from structural engineering principles:</w:t>
+      </w:r>
+    </w:p>
+    <w:p>
+      <w:pPr>
+        <w:pStyle w:val="ListNumber"/>
+        <w:spacing w:after="60"/>
+      </w:pPr>
+      <w:r/>
+      <w:r>
+        <w:rPr>
+          <w:b/>
+        </w:rPr>
+        <w:t xml:space="preserve"> contoured sills ("Undervanes")</w:t>
+      </w:r>
+      <w:r>
+        <w:t>: Large, interlocking granite rock cross-vanes or J-hooks are arched upstream to act as "undervanes." This lifts upstream water levels (backwater effect) by 0.3m to 0.6m, preventing seasonal headcutting and drying.</w:t>
+      </w:r>
+    </w:p>
+    <w:p>
+      <w:pPr>
+        <w:pStyle w:val="ListNumber"/>
+        <w:spacing w:after="60"/>
+      </w:pPr>
+      <w:r/>
+      <w:r>
+        <w:rPr>
+          <w:b/>
+        </w:rPr>
+        <w:t>Support Cups (Root-Wad Structures)</w:t>
+      </w:r>
+      <w:r>
+        <w:t>: Live-planted outer bank structures shape and support the banks like protective cups, stabilizing the stream banks under massive storm shear stresses and eliminating lateral erosion.</w:t>
+      </w:r>
+    </w:p>
+    <w:p>
+      <w:pPr>
+        <w:pStyle w:val="ListNumber"/>
+        <w:spacing w:after="60"/>
+      </w:pPr>
+      <w:r/>
+      <w:r>
+        <w:rPr>
+          <w:b/>
+        </w:rPr>
+        <w:t>Cascading Step-Downs</w:t>
+      </w:r>
+      <w:r>
+        <w:t>: Water flows from one deep plunge-pool chamber (depths of 1.5m to 2.5m) over a rock weir sill into the next. Each step is connected by a steep, high-velocity chute, generating a self-sustaining series of deep holding ponds.</w:t>
+      </w:r>
+    </w:p>
+    <w:p>
+      <w:r>
+        <w:t>#### Atmospheric Aeration &amp; Gas Saturation (Henry's &amp; Game-Gameson Laws)</w:t>
+      </w:r>
+    </w:p>
+    <w:p>
+      <w:r>
+        <w:t xml:space="preserve">As water plunges from one step-down pond to another, the high-velocity turbulence draws in atmospheric air, forcing dissolved oxygen to maximum saturation (Henry's Law). The oxygen deficit ratio (r) across the weir steps is governed by the </w:t>
+      </w:r>
+      <w:r>
+        <w:rPr>
+          <w:b/>
+        </w:rPr>
+        <w:t>Game-Gameson Aeration Equation</w:t>
+      </w:r>
+      <w:r>
+        <w:t>:</w:t>
+      </w:r>
+    </w:p>
+    <w:p>
+      <w:r>
+        <w:t>r = 1 + 0.38 · a · b · H · (1 - 0.11 · H) · (1 + 0.046 · T)</w:t>
+      </w:r>
+    </w:p>
+    <w:p>
+      <w:pPr>
+        <w:pStyle w:val="ListBullet"/>
+        <w:spacing w:after="60"/>
+      </w:pPr>
+      <w:r>
+        <w:t>*Where*:</w:t>
+      </w:r>
+    </w:p>
+    <w:p>
+      <w:pPr>
+        <w:pStyle w:val="ListBullet"/>
+        <w:spacing w:after="60"/>
+      </w:pPr>
+      <w:r/>
+      <w:r>
+        <w:rPr>
+          <w:b/>
+        </w:rPr>
+        <w:t>r</w:t>
+      </w:r>
+      <w:r>
+        <w:t xml:space="preserve"> is the oxygen deficit ratio (Cs - Cin) / (Cs - Cout).</w:t>
+      </w:r>
+    </w:p>
+    <w:p>
+      <w:pPr>
+        <w:pStyle w:val="ListBullet"/>
+        <w:spacing w:after="60"/>
+      </w:pPr>
+      <w:r/>
+      <w:r>
+        <w:rPr>
+          <w:b/>
+        </w:rPr>
+        <w:t>a</w:t>
+      </w:r>
+      <w:r>
+        <w:t xml:space="preserve"> is the water quality factor (1.25 for clean mountain streams).</w:t>
+      </w:r>
+    </w:p>
+    <w:p>
+      <w:pPr>
+        <w:pStyle w:val="ListBullet"/>
+        <w:spacing w:after="60"/>
+      </w:pPr>
+      <w:r/>
+      <w:r>
+        <w:rPr>
+          <w:b/>
+        </w:rPr>
+        <w:t>b</w:t>
+      </w:r>
+      <w:r>
+        <w:t xml:space="preserve"> is the structure geometry coefficient (1.35 for highly turbulent rock vanes).</w:t>
+      </w:r>
+    </w:p>
+    <w:p>
+      <w:pPr>
+        <w:pStyle w:val="ListBullet"/>
+        <w:spacing w:after="60"/>
+      </w:pPr>
+      <w:r/>
+      <w:r>
+        <w:rPr>
+          <w:b/>
+        </w:rPr>
+        <w:t>H</w:t>
+      </w:r>
+      <w:r>
+        <w:t xml:space="preserve"> is the hydraulic drop height per step (meters, target H = 0.50m).</w:t>
+      </w:r>
+    </w:p>
+    <w:p>
+      <w:pPr>
+        <w:pStyle w:val="ListBullet"/>
+        <w:spacing w:after="60"/>
+      </w:pPr>
+      <w:r/>
+      <w:r>
+        <w:rPr>
+          <w:b/>
+        </w:rPr>
+        <w:t>T</w:t>
+      </w:r>
+      <w:r>
+        <w:t xml:space="preserve"> is the water temperature (°C).</w:t>
+      </w:r>
+    </w:p>
+    <w:p>
+      <w:r>
+        <w:t>Through 3 to 4 sequential step plunge pools (total head drop of 1.5m to 2.0m), oxygen-depleted upstream pasture water (e.g. DO = 5.2 mg/L at 18.0°C) is aggressively aerated, emerging at near-100% saturation (DO &gt;= 8.6 mg/L) at the spawning tail-out, which is optimal for wild brown trout respiration.</w:t>
+      </w:r>
+    </w:p>
+    <w:p>
+      <w:r>
+        <w:t>#### Plunge Pool Bed Mechanics &amp; Silt Flushing</w:t>
+      </w:r>
+    </w:p>
+    <w:p>
+      <w:r>
+        <w:t>To prevent fine pasture silt (&lt;2mm) from settling on the sorted spawning gravel beds (</w:t>
+      </w:r>
+      <w:r>
+        <w:rPr>
+          <w:rFonts w:ascii="Georgia" w:hAnsi="Georgia"/>
+          <w:i/>
+        </w:rPr>
+        <w:t>D_{50} = 22\text{mm}</w:t>
+      </w:r>
+      <w:r>
+        <w:t xml:space="preserve">), the pool bed hydraulics are designed to generate high local shear stress (τ) using the </w:t>
+      </w:r>
+      <w:r>
+        <w:rPr>
+          <w:b/>
+        </w:rPr>
+        <w:t>DuBoys Equation</w:t>
+      </w:r>
+      <w:r>
+        <w:t>:</w:t>
+      </w:r>
+    </w:p>
+    <w:p>
+      <w:r>
+        <w:t>τ = γ · R · S</w:t>
+      </w:r>
+    </w:p>
+    <w:p>
+      <w:pPr>
+        <w:pStyle w:val="ListBullet"/>
+        <w:spacing w:after="60"/>
+      </w:pPr>
+      <w:r>
+        <w:t>*Where*:</w:t>
+      </w:r>
+    </w:p>
+    <w:p>
+      <w:pPr>
+        <w:pStyle w:val="ListBullet"/>
+        <w:spacing w:after="60"/>
+      </w:pPr>
+      <w:r/>
+      <w:r>
+        <w:rPr>
+          <w:b/>
+        </w:rPr>
+        <w:t>τ</w:t>
+      </w:r>
+      <w:r>
+        <w:t xml:space="preserve"> is the boundary shear stress (N/m²).</w:t>
+      </w:r>
+    </w:p>
+    <w:p>
+      <w:pPr>
+        <w:pStyle w:val="ListBullet"/>
+        <w:spacing w:after="60"/>
+      </w:pPr>
+      <w:r/>
+      <w:r>
+        <w:rPr>
+          <w:b/>
+        </w:rPr>
+        <w:t>γ</w:t>
+      </w:r>
+      <w:r>
+        <w:t xml:space="preserve"> is the unit weight of water (9,810 N/m³).</w:t>
+      </w:r>
+    </w:p>
+    <w:p>
+      <w:pPr>
+        <w:pStyle w:val="ListBullet"/>
+        <w:spacing w:after="60"/>
+      </w:pPr>
+      <w:r/>
+      <w:r>
+        <w:rPr>
+          <w:b/>
+        </w:rPr>
+        <w:t>R</w:t>
+      </w:r>
+      <w:r>
+        <w:t xml:space="preserve"> is the hydraulic radius (design R = 0.65m in plunge pool throat).</w:t>
+      </w:r>
+    </w:p>
+    <w:p>
+      <w:pPr>
+        <w:pStyle w:val="ListBullet"/>
+        <w:spacing w:after="60"/>
+      </w:pPr>
+      <w:r/>
+      <w:r>
+        <w:rPr>
+          <w:b/>
+        </w:rPr>
+        <w:t>S</w:t>
+      </w:r>
+      <w:r>
+        <w:t xml:space="preserve"> is the local energy slope (0.008 during 2-year storm events).</w:t>
+      </w:r>
+    </w:p>
+    <w:p>
+      <w:r>
+        <w:t>This concentrates local boundary shear stress to τ ≈ 51.0 N/m² in the pool throats. Fine silt is suspended and scoured out at a critical threshold of τ_c = 0.25 to 1.8 N/m², whereas spawning gravels (</w:t>
+      </w:r>
+      <w:r>
+        <w:rPr>
+          <w:rFonts w:ascii="Georgia" w:hAnsi="Georgia"/>
+          <w:i/>
+        </w:rPr>
+        <w:t>D_{50} = 22\text{mm}</w:t>
+      </w:r>
+      <w:r>
+        <w:t>) remain stable, ensuring that each pool tail-out behaves as a self-cleaning spawning bed.</w:t>
       </w:r>
     </w:p>
     <w:p>

</xml_diff>